<commit_message>
fix: heading styles for Word navigation + remove Chinese chars + fix English fragments
</commit_message>
<xml_diff>
--- a/docs/Diplom/Глава_4_Описание_результатов_применения_разработки.docx
+++ b/docs/Diplom/Глава_4_Описание_результатов_применения_разработки.docx
@@ -4,15 +4,9 @@
   <w:body>
     <w:p>
       <w:pPr>
-        <w:spacing w:before="240" w:after="240" w:line="360" w:lineRule="auto"/>
-        <w:jc w:val="center"/>
+        <w:pStyle w:val="Heading1"/>
       </w:pPr>
       <w:r>
-        <w:rPr>
-          <w:rFonts w:ascii="Times New Roman" w:hAnsi="Times New Roman"/>
-          <w:b/>
-          <w:sz w:val="32"/>
-        </w:rPr>
         <w:t>ГЛАВА 4. ОПИСАНИЕ РЕЗУЛЬТАТОВ ПРИМЕНЕНИЯ РАЗРАБОТКИ</w:t>
       </w:r>
     </w:p>
@@ -46,15 +40,9 @@
     </w:p>
     <w:p>
       <w:pPr>
-        <w:spacing w:before="240" w:after="120" w:line="360" w:lineRule="auto"/>
-        <w:jc w:val="left"/>
+        <w:pStyle w:val="Heading2"/>
       </w:pPr>
       <w:r>
-        <w:rPr>
-          <w:rFonts w:ascii="Times New Roman" w:hAnsi="Times New Roman"/>
-          <w:b/>
-          <w:sz w:val="30"/>
-        </w:rPr>
         <w:t>4.1. Руководство пользователя программным комплексом</w:t>
       </w:r>
     </w:p>
@@ -74,15 +62,9 @@
     </w:p>
     <w:p>
       <w:pPr>
-        <w:spacing w:before="120" w:after="120" w:line="360" w:lineRule="auto"/>
-        <w:jc w:val="left"/>
+        <w:pStyle w:val="Heading3"/>
       </w:pPr>
       <w:r>
-        <w:rPr>
-          <w:rFonts w:ascii="Times New Roman" w:hAnsi="Times New Roman"/>
-          <w:b/>
-          <w:sz w:val="28"/>
-        </w:rPr>
         <w:t>4.1.1. Общее описание интерфейса</w:t>
       </w:r>
     </w:p>
@@ -116,15 +98,9 @@
     </w:p>
     <w:p>
       <w:pPr>
-        <w:spacing w:before="120" w:after="120" w:line="360" w:lineRule="auto"/>
-        <w:jc w:val="left"/>
+        <w:pStyle w:val="Heading3"/>
       </w:pPr>
       <w:r>
-        <w:rPr>
-          <w:rFonts w:ascii="Times New Roman" w:hAnsi="Times New Roman"/>
-          <w:b/>
-          <w:sz w:val="28"/>
-        </w:rPr>
         <w:t>4.1.2. Загрузка аудиофайлов и настройка параметров</w:t>
       </w:r>
     </w:p>
@@ -738,15 +714,9 @@
     </w:p>
     <w:p>
       <w:pPr>
-        <w:spacing w:before="120" w:after="120" w:line="360" w:lineRule="auto"/>
-        <w:jc w:val="left"/>
+        <w:pStyle w:val="Heading3"/>
       </w:pPr>
       <w:r>
-        <w:rPr>
-          <w:rFonts w:ascii="Times New Roman" w:hAnsi="Times New Roman"/>
-          <w:b/>
-          <w:sz w:val="28"/>
-        </w:rPr>
         <w:t>4.1.3. Проведение сравнительного эксперимента</w:t>
       </w:r>
     </w:p>
@@ -794,15 +764,9 @@
     </w:p>
     <w:p>
       <w:pPr>
-        <w:spacing w:before="120" w:after="120" w:line="360" w:lineRule="auto"/>
-        <w:jc w:val="left"/>
+        <w:pStyle w:val="Heading3"/>
       </w:pPr>
       <w:r>
-        <w:rPr>
-          <w:rFonts w:ascii="Times New Roman" w:hAnsi="Times New Roman"/>
-          <w:b/>
-          <w:sz w:val="28"/>
-        </w:rPr>
         <w:t>4.1.4. Анализ и экспорт результатов</w:t>
       </w:r>
     </w:p>
@@ -831,7 +795,7 @@
           <w:rFonts w:ascii="Times New Roman" w:hAnsi="Times New Roman"/>
           <w:sz w:val="28"/>
         </w:rPr>
-        <w:t>Визуализация результатов включает следующие типы графиков (рисунок 4.3): столбчатые диаграммы сравнения методов по отдельным метрикам,箱型 диаграммы распределения метрик по аудиофайлам, тепловые карты для визуализации попарных сравнений и линейные графики зависимости метрик от параметров обработки. Каждый график может быть сохранён в формате PNG.</w:t>
+        <w:t>Визуализация результатов включает следующие типы графиков (рисунок 4.3): столбчатые диаграммы сравнения методов по отдельным метрикам, ящиковые диаграммы распределения метрик по аудиофайлам, тепловые карты для визуализации попарных сравнений и линейные графики зависимости метрик от параметров обработки. Каждый график может быть сохранён в формате PNG.</w:t>
       </w:r>
     </w:p>
     <w:p>
@@ -850,15 +814,9 @@
     </w:p>
     <w:p>
       <w:pPr>
-        <w:spacing w:before="240" w:after="120" w:line="360" w:lineRule="auto"/>
-        <w:jc w:val="left"/>
+        <w:pStyle w:val="Heading2"/>
       </w:pPr>
       <w:r>
-        <w:rPr>
-          <w:rFonts w:ascii="Times New Roman" w:hAnsi="Times New Roman"/>
-          <w:b/>
-          <w:sz w:val="30"/>
-        </w:rPr>
         <w:t>4.2. Методология экспериментального исследования</w:t>
       </w:r>
     </w:p>
@@ -920,15 +878,9 @@
     </w:p>
     <w:p>
       <w:pPr>
-        <w:spacing w:before="240" w:after="120" w:line="360" w:lineRule="auto"/>
-        <w:jc w:val="left"/>
+        <w:pStyle w:val="Heading2"/>
       </w:pPr>
       <w:r>
-        <w:rPr>
-          <w:rFonts w:ascii="Times New Roman" w:hAnsi="Times New Roman"/>
-          <w:b/>
-          <w:sz w:val="30"/>
-        </w:rPr>
         <w:t>4.3. Результаты сравнительного анализа методов обработки аудиоданных</w:t>
       </w:r>
     </w:p>
@@ -948,15 +900,9 @@
     </w:p>
     <w:p>
       <w:pPr>
-        <w:spacing w:before="120" w:after="120" w:line="360" w:lineRule="auto"/>
-        <w:jc w:val="left"/>
+        <w:pStyle w:val="Heading3"/>
       </w:pPr>
       <w:r>
-        <w:rPr>
-          <w:rFonts w:ascii="Times New Roman" w:hAnsi="Times New Roman"/>
-          <w:b/>
-          <w:sz w:val="28"/>
-        </w:rPr>
         <w:t>4.3.1. Сравнение по метрикам временной области</w:t>
       </w:r>
     </w:p>
@@ -2086,15 +2032,9 @@
     </w:p>
     <w:p>
       <w:pPr>
-        <w:spacing w:before="120" w:after="120" w:line="360" w:lineRule="auto"/>
-        <w:jc w:val="left"/>
+        <w:pStyle w:val="Heading3"/>
       </w:pPr>
       <w:r>
-        <w:rPr>
-          <w:rFonts w:ascii="Times New Roman" w:hAnsi="Times New Roman"/>
-          <w:b/>
-          <w:sz w:val="28"/>
-        </w:rPr>
         <w:t>4.3.2. Сравнение по метрикам спектральной области</w:t>
       </w:r>
     </w:p>
@@ -3012,15 +2952,9 @@
     </w:p>
     <w:p>
       <w:pPr>
-        <w:spacing w:before="120" w:after="120" w:line="360" w:lineRule="auto"/>
-        <w:jc w:val="left"/>
+        <w:pStyle w:val="Heading3"/>
       </w:pPr>
       <w:r>
-        <w:rPr>
-          <w:rFonts w:ascii="Times New Roman" w:hAnsi="Times New Roman"/>
-          <w:b/>
-          <w:sz w:val="28"/>
-        </w:rPr>
         <w:t>4.3.3. Сравнение по психоакустическим метрикам и оценка достоверности</w:t>
       </w:r>
     </w:p>
@@ -3934,15 +3868,9 @@
     </w:p>
     <w:p>
       <w:pPr>
-        <w:spacing w:before="120" w:after="120" w:line="360" w:lineRule="auto"/>
-        <w:jc w:val="left"/>
+        <w:pStyle w:val="Heading3"/>
       </w:pPr>
       <w:r>
-        <w:rPr>
-          <w:rFonts w:ascii="Times New Roman" w:hAnsi="Times New Roman"/>
-          <w:b/>
-          <w:sz w:val="28"/>
-        </w:rPr>
         <w:t>4.3.4. Корреляционный анализ</w:t>
       </w:r>
     </w:p>
@@ -4840,15 +4768,9 @@
     </w:p>
     <w:p>
       <w:pPr>
-        <w:spacing w:before="120" w:after="120" w:line="360" w:lineRule="auto"/>
-        <w:jc w:val="left"/>
+        <w:pStyle w:val="Heading3"/>
       </w:pPr>
       <w:r>
-        <w:rPr>
-          <w:rFonts w:ascii="Times New Roman" w:hAnsi="Times New Roman"/>
-          <w:b/>
-          <w:sz w:val="28"/>
-        </w:rPr>
         <w:t>4.3.5. Сводная таблица и попарный анализ</w:t>
       </w:r>
     </w:p>
@@ -9685,15 +9607,9 @@
     </w:p>
     <w:p>
       <w:pPr>
-        <w:spacing w:before="120" w:after="120" w:line="360" w:lineRule="auto"/>
-        <w:jc w:val="left"/>
+        <w:pStyle w:val="Heading3"/>
       </w:pPr>
       <w:r>
-        <w:rPr>
-          <w:rFonts w:ascii="Times New Roman" w:hAnsi="Times New Roman"/>
-          <w:b/>
-          <w:sz w:val="28"/>
-        </w:rPr>
         <w:t>4.3.6. Анализ компромиссов: качество, скорость, сжатие</w:t>
       </w:r>
     </w:p>
@@ -10809,15 +10725,9 @@
     </w:p>
     <w:p>
       <w:pPr>
-        <w:spacing w:before="120" w:after="120" w:line="360" w:lineRule="auto"/>
-        <w:jc w:val="left"/>
+        <w:pStyle w:val="Heading3"/>
       </w:pPr>
       <w:r>
-        <w:rPr>
-          <w:rFonts w:ascii="Times New Roman" w:hAnsi="Times New Roman"/>
-          <w:b/>
-          <w:sz w:val="28"/>
-        </w:rPr>
         <w:t>4.3.7. Влияние типа аудиоконтента</w:t>
       </w:r>
     </w:p>
@@ -10851,15 +10761,9 @@
     </w:p>
     <w:p>
       <w:pPr>
-        <w:spacing w:before="240" w:after="120" w:line="360" w:lineRule="auto"/>
-        <w:jc w:val="left"/>
+        <w:pStyle w:val="Heading2"/>
       </w:pPr>
       <w:r>
-        <w:rPr>
-          <w:rFonts w:ascii="Times New Roman" w:hAnsi="Times New Roman"/>
-          <w:b/>
-          <w:sz w:val="30"/>
-        </w:rPr>
         <w:t>4.4. Анализ применимости метода FWHT</w:t>
       </w:r>
     </w:p>
@@ -10874,20 +10778,14 @@
           <w:rFonts w:ascii="Times New Roman" w:hAnsi="Times New Roman"/>
           <w:sz w:val="28"/>
         </w:rPr>
-        <w:t>На основании экспериментальных данных проведён целевой анализ применимости быстрого преобразования Уолша-Адамара. Анализ строится по двум осям: сравнение с каждым альтернативным методом для выявления причин优势和 ограничений FWHT, а также оценка применимости в конкретных сценариях использования.</w:t>
+        <w:t>На основании экспериментальных данных проведён целевой анализ применимости быстрого преобразования Уолша-Адамара. Анализ строится по двум осям: сравнение с каждым альтернативным методом для выявления преимуществ и ограничений FWHT, а также оценка применимости в конкретных сценариях использования.</w:t>
       </w:r>
     </w:p>
     <w:p>
       <w:pPr>
-        <w:spacing w:before="120" w:after="120" w:line="360" w:lineRule="auto"/>
-        <w:jc w:val="left"/>
+        <w:pStyle w:val="Heading3"/>
       </w:pPr>
       <w:r>
-        <w:rPr>
-          <w:rFonts w:ascii="Times New Roman" w:hAnsi="Times New Roman"/>
-          <w:b/>
-          <w:sz w:val="28"/>
-        </w:rPr>
         <w:t>4.4.1. FWHT vs Стандартный MP3 - базовый бенчмарк</w:t>
       </w:r>
     </w:p>
@@ -10921,15 +10819,9 @@
     </w:p>
     <w:p>
       <w:pPr>
-        <w:spacing w:before="120" w:after="120" w:line="360" w:lineRule="auto"/>
-        <w:jc w:val="left"/>
+        <w:pStyle w:val="Heading3"/>
       </w:pPr>
       <w:r>
-        <w:rPr>
-          <w:rFonts w:ascii="Times New Roman" w:hAnsi="Times New Roman"/>
-          <w:b/>
-          <w:sz w:val="28"/>
-        </w:rPr>
         <w:t>4.4.2. FWHT vs альтернативные пользовательские методы</w:t>
       </w:r>
     </w:p>
@@ -11019,15 +10911,9 @@
     </w:p>
     <w:p>
       <w:pPr>
-        <w:spacing w:before="120" w:after="120" w:line="360" w:lineRule="auto"/>
-        <w:jc w:val="left"/>
+        <w:pStyle w:val="Heading3"/>
       </w:pPr>
       <w:r>
-        <w:rPr>
-          <w:rFonts w:ascii="Times New Roman" w:hAnsi="Times New Roman"/>
-          <w:b/>
-          <w:sz w:val="28"/>
-        </w:rPr>
         <w:t>4.4.3. FWHT в сценариях применения</w:t>
       </w:r>
     </w:p>
@@ -11869,15 +11755,9 @@
     </w:p>
     <w:p>
       <w:pPr>
-        <w:spacing w:before="120" w:after="120" w:line="360" w:lineRule="auto"/>
-        <w:jc w:val="left"/>
+        <w:pStyle w:val="Heading3"/>
       </w:pPr>
       <w:r>
-        <w:rPr>
-          <w:rFonts w:ascii="Times New Roman" w:hAnsi="Times New Roman"/>
-          <w:b/>
-          <w:sz w:val="28"/>
-        </w:rPr>
         <w:t>4.4.4. Преимущества и ограничения метода FWHT</w:t>
       </w:r>
     </w:p>
@@ -12457,29 +12337,17 @@
     <w:p/>
     <w:p>
       <w:pPr>
-        <w:spacing w:before="240" w:after="120" w:line="360" w:lineRule="auto"/>
-        <w:jc w:val="left"/>
+        <w:pStyle w:val="Heading2"/>
       </w:pPr>
       <w:r>
-        <w:rPr>
-          <w:rFonts w:ascii="Times New Roman" w:hAnsi="Times New Roman"/>
-          <w:b/>
-          <w:sz w:val="30"/>
-        </w:rPr>
         <w:t>4.5. Рекомендации по развитию и экономическая эффективность</w:t>
       </w:r>
     </w:p>
     <w:p>
       <w:pPr>
-        <w:spacing w:before="120" w:after="120" w:line="360" w:lineRule="auto"/>
-        <w:jc w:val="left"/>
+        <w:pStyle w:val="Heading3"/>
       </w:pPr>
       <w:r>
-        <w:rPr>
-          <w:rFonts w:ascii="Times New Roman" w:hAnsi="Times New Roman"/>
-          <w:b/>
-          <w:sz w:val="28"/>
-        </w:rPr>
         <w:t>4.5.1. Оптимизация производительности FWHT</w:t>
       </w:r>
     </w:p>
@@ -12555,15 +12423,9 @@
     </w:p>
     <w:p>
       <w:pPr>
-        <w:spacing w:before="120" w:after="120" w:line="360" w:lineRule="auto"/>
-        <w:jc w:val="left"/>
+        <w:pStyle w:val="Heading3"/>
       </w:pPr>
       <w:r>
-        <w:rPr>
-          <w:rFonts w:ascii="Times New Roman" w:hAnsi="Times New Roman"/>
-          <w:b/>
-          <w:sz w:val="28"/>
-        </w:rPr>
         <w:t>4.5.2. Аппаратная реализация FWHT на FPGA/DSP</w:t>
       </w:r>
     </w:p>
@@ -12578,7 +12440,7 @@
           <w:rFonts w:ascii="Times New Roman" w:hAnsi="Times New Roman"/>
           <w:sz w:val="28"/>
         </w:rPr>
-        <w:t>Отсутствие операций умножения является уникальным преимуществом FWHT перед остальными методами. На FPGA реализация FWHT требует только сумматоров и вычитателей, что существенно сокращает площадь кристалла и энергопотребление по сравнению с FFT, necessitating hardware multipliers. Для типичного размера блока 2048 отсчётов архитектура FWHT на FPGA может быть реализована с тактовой частотой 100-200 МГц, обеспечивая обработку в реальном времени для аудиосигналов с частотой дискретизации до 48 кГц.</w:t>
+        <w:t>Отсутствие операций умножения является уникальным преимуществом FWHT перед остальными методами. На FPGA реализация FWHT требует только сумматоров и вычитателей, что существенно сокращает площадь кристалла и энергопотребление по сравнению с FFT, требующего аппаратных умножителей. Для типичного размера блока 2048 отсчётов архитектура FWHT на FPGA может быть реализована с тактовой частотой 100-200 МГц, обеспечивая обработку в реальном времени для аудиосигналов с частотой дискретизации до 48 кГц.</w:t>
       </w:r>
     </w:p>
     <w:p>
@@ -12611,15 +12473,9 @@
     </w:p>
     <w:p>
       <w:pPr>
-        <w:spacing w:before="120" w:after="120" w:line="360" w:lineRule="auto"/>
-        <w:jc w:val="left"/>
+        <w:pStyle w:val="Heading3"/>
       </w:pPr>
       <w:r>
-        <w:rPr>
-          <w:rFonts w:ascii="Times New Roman" w:hAnsi="Times New Roman"/>
-          <w:b/>
-          <w:sz w:val="28"/>
-        </w:rPr>
         <w:t>4.5.3. Исправление неработоспособных методов</w:t>
       </w:r>
     </w:p>
@@ -12653,15 +12509,9 @@
     </w:p>
     <w:p>
       <w:pPr>
-        <w:spacing w:before="120" w:after="120" w:line="360" w:lineRule="auto"/>
-        <w:jc w:val="left"/>
+        <w:pStyle w:val="Heading3"/>
       </w:pPr>
       <w:r>
-        <w:rPr>
-          <w:rFonts w:ascii="Times New Roman" w:hAnsi="Times New Roman"/>
-          <w:b/>
-          <w:sz w:val="28"/>
-        </w:rPr>
         <w:t>4.5.4. Интеграция с ML-методами</w:t>
       </w:r>
     </w:p>
@@ -12681,15 +12531,9 @@
     </w:p>
     <w:p>
       <w:pPr>
-        <w:spacing w:before="120" w:after="120" w:line="360" w:lineRule="auto"/>
-        <w:jc w:val="left"/>
+        <w:pStyle w:val="Heading3"/>
       </w:pPr>
       <w:r>
-        <w:rPr>
-          <w:rFonts w:ascii="Times New Roman" w:hAnsi="Times New Roman"/>
-          <w:b/>
-          <w:sz w:val="28"/>
-        </w:rPr>
         <w:t>4.5.5. Оценка экономической эффективности</w:t>
       </w:r>
     </w:p>
@@ -12737,15 +12581,9 @@
     </w:p>
     <w:p>
       <w:pPr>
-        <w:spacing w:before="240" w:after="120" w:line="360" w:lineRule="auto"/>
-        <w:jc w:val="left"/>
+        <w:pStyle w:val="Heading2"/>
       </w:pPr>
       <w:r>
-        <w:rPr>
-          <w:rFonts w:ascii="Times New Roman" w:hAnsi="Times New Roman"/>
-          <w:b/>
-          <w:sz w:val="30"/>
-        </w:rPr>
         <w:t>4.6. Выводы по главе</w:t>
       </w:r>
     </w:p>
@@ -13284,15 +13122,16 @@
     <w:pPr>
       <w:keepNext/>
       <w:keepLines/>
-      <w:spacing w:before="480" w:after="0"/>
+      <w:spacing w:before="240" w:after="240" w:line="360" w:lineRule="auto"/>
+      <w:jc w:val="center"/>
       <w:outlineLvl w:val="0"/>
     </w:pPr>
     <w:rPr>
-      <w:rFonts w:asciiTheme="majorHAnsi" w:eastAsiaTheme="majorEastAsia" w:hAnsiTheme="majorHAnsi" w:cstheme="majorBidi"/>
+      <w:rFonts w:asciiTheme="majorHAnsi" w:eastAsiaTheme="majorEastAsia" w:hAnsiTheme="majorHAnsi" w:cstheme="majorBidi" w:ascii="Times New Roman" w:hAnsi="Times New Roman" w:cs="Times New Roman"/>
       <w:b/>
       <w:bCs/>
-      <w:color w:val="365F91" w:themeColor="accent1" w:themeShade="BF"/>
-      <w:sz w:val="28"/>
+      <w:color w:val="000000"/>
+      <w:sz w:val="32"/>
       <w:szCs w:val="28"/>
     </w:rPr>
   </w:style>
@@ -13308,15 +13147,16 @@
     <w:pPr>
       <w:keepNext/>
       <w:keepLines/>
-      <w:spacing w:before="200" w:after="0"/>
+      <w:spacing w:before="240" w:after="120" w:line="360" w:lineRule="auto"/>
+      <w:jc w:val="left"/>
       <w:outlineLvl w:val="1"/>
     </w:pPr>
     <w:rPr>
-      <w:rFonts w:asciiTheme="majorHAnsi" w:eastAsiaTheme="majorEastAsia" w:hAnsiTheme="majorHAnsi" w:cstheme="majorBidi"/>
+      <w:rFonts w:asciiTheme="majorHAnsi" w:eastAsiaTheme="majorEastAsia" w:hAnsiTheme="majorHAnsi" w:cstheme="majorBidi" w:ascii="Times New Roman" w:hAnsi="Times New Roman" w:cs="Times New Roman"/>
       <w:b/>
       <w:bCs/>
-      <w:color w:val="4F81BD" w:themeColor="accent1"/>
-      <w:sz w:val="26"/>
+      <w:color w:val="000000"/>
+      <w:sz w:val="30"/>
       <w:szCs w:val="26"/>
     </w:rPr>
   </w:style>
@@ -13332,14 +13172,16 @@
     <w:pPr>
       <w:keepNext/>
       <w:keepLines/>
-      <w:spacing w:before="200" w:after="0"/>
+      <w:spacing w:before="120" w:after="120" w:line="360" w:lineRule="auto"/>
+      <w:jc w:val="left"/>
       <w:outlineLvl w:val="2"/>
     </w:pPr>
     <w:rPr>
-      <w:rFonts w:asciiTheme="majorHAnsi" w:eastAsiaTheme="majorEastAsia" w:hAnsiTheme="majorHAnsi" w:cstheme="majorBidi"/>
+      <w:rFonts w:asciiTheme="majorHAnsi" w:eastAsiaTheme="majorEastAsia" w:hAnsiTheme="majorHAnsi" w:cstheme="majorBidi" w:ascii="Times New Roman" w:hAnsi="Times New Roman" w:cs="Times New Roman"/>
       <w:b/>
       <w:bCs/>
-      <w:color w:val="4F81BD" w:themeColor="accent1"/>
+      <w:color w:val="000000"/>
+      <w:sz w:val="28"/>
     </w:rPr>
   </w:style>
   <w:style w:type="paragraph" w:styleId="Heading4">

</xml_diff>

<commit_message>
fix: spectrum colors + DOCX reforms (no refs, Cyrillic 'none', spectrum analysis)
</commit_message>
<xml_diff>
--- a/docs/Diplom/Глава_4_Описание_результатов_применения_разработки.docx
+++ b/docs/Diplom/Глава_4_Описание_результатов_применения_разработки.docx
@@ -417,7 +417,7 @@
                 <w:b w:val="0"/>
                 <w:sz w:val="18"/>
               </w:rPr>
-              <w:t>none, energy,</w:t>
+              <w:t>нет, energy,</w:t>
               <w:br/>
               <w:t>lowpass</w:t>
             </w:r>
@@ -695,7 +695,7 @@
           <w:rFonts w:ascii="Times New Roman" w:hAnsi="Times New Roman"/>
           <w:sz w:val="28"/>
         </w:rPr>
-        <w:t>Режим отбора «none» сохраняет все коэффициенты преобразования, обеспечивая идеальную реконструкцию сигнала. Режим «energy» ранжирует коэффициенты по абсолютному значению энергии и сохраняет минимальное их количество, при котором суммарная энергия составляет заданную долю от исходной. Режим «lowpass» отбрасывает высокочастотные коэффициенты, сохраняя только низкочастотную часть спектра. Именно режимы «energy» и «lowpass» обеспечивают сжатие сигнала и являются предметом сравнительного анализа.</w:t>
+        <w:t>Режим отбора «нет» сохраняет все коэффициенты преобразования, обеспечивая идеальную реконструкцию сигнала. Режим «energy» ранжирует коэффициенты по абсолютному значению энергии и сохраняет минимальное их количество, при котором суммарная энергия составляет заданную долю от исходной. Режим «lowpass» отбрасывает высокочастотные коэффициенты, сохраняя только низкочастотную часть спектра. Именно режимы «energy» и «lowpass» обеспечивают сжатие сигнала и являются предметом сравнительного анализа.</w:t>
       </w:r>
     </w:p>
     <w:p>
@@ -2952,6 +2952,48 @@
     </w:p>
     <w:p>
       <w:pPr>
+        <w:spacing w:line="360" w:lineRule="auto" w:after="0"/>
+        <w:ind w:firstLine="709"/>
+        <w:jc w:val="both"/>
+      </w:pPr>
+      <w:r>
+        <w:rPr>
+          <w:rFonts w:ascii="Times New Roman" w:hAnsi="Times New Roman"/>
+          <w:sz w:val="28"/>
+        </w:rPr>
+        <w:t>Визуальное сравнение спектров (рисунок 4.4) наглядно подтверждает количественные данные. На спектрограмме исходного сигнала и его обработанных версий хорошо видно, что кривая Стандартного MP3 практически совпадает с исходным сигналом во всём диапазоне частот, что объясняет минимальное значение LSD (5,98 дБ). Кривая FWHT демонстрирует заметное отклонение от исходного спектра в области средних и высоких частот (выше 2 кГц), при этом в низкочастотной области (до 500 Гц) различие минимально. Данный паттерн объясняется тем, что энергия речевых и музыкальных сигналов сосредоточена в низкочастотной области, поэтому при отборе коэффициентов по энергетическому критерию именно низкочастотные компоненты сохраняются с наибольшей точностью.</w:t>
+      </w:r>
+    </w:p>
+    <w:p>
+      <w:pPr>
+        <w:spacing w:line="360" w:lineRule="auto" w:after="0"/>
+        <w:ind w:firstLine="709"/>
+        <w:jc w:val="both"/>
+      </w:pPr>
+      <w:r>
+        <w:rPr>
+          <w:rFonts w:ascii="Times New Roman" w:hAnsi="Times New Roman"/>
+          <w:sz w:val="28"/>
+        </w:rPr>
+        <w:t>Сравнение FWHT и DWT на спектрограмме (рисунок 4.5) показывает практически совпадающие кривые в низкочастотной области и схожий характер отклонений в высокочастотной области. Это визуально подтверждает близкие значения LSD (24,57 и 24,86 дБ) и центроидного смещения (1445 и 1530 Гц). Однако кривая DWT демонстрирует более плавный характер отклонения, тогда как кривая FWHT имеет более выраженные локальные пики, что связано с дискретной природой функций Уолша по сравнению с непрерывной структурой вейвлета Хаара.</w:t>
+      </w:r>
+    </w:p>
+    <w:p>
+      <w:pPr>
+        <w:spacing w:line="360" w:lineRule="auto" w:after="0"/>
+        <w:ind w:firstLine="709"/>
+        <w:jc w:val="both"/>
+      </w:pPr>
+      <w:r>
+        <w:rPr>
+          <w:rFonts w:ascii="Times New Roman" w:hAnsi="Times New Roman"/>
+          <w:sz w:val="28"/>
+        </w:rPr>
+        <w:t>На спектрограмме, демонстрирующей все девять методов (рисунок 4.6), отчётливо прослеживается три группы методов по характеру спектральных искажений. Первая группа (Стандартный MP3, Хаффман MP3, Розенброк MP3) — кривые, максимально приближенные к исходному сигналу. Вторая группа (FWHT, DWT, MDCT) — кривые с умеренным отклонением, сохраняющие общую форму спектра, но вносящие заметные искажения в области выше 2 кГц. Третья группа (FFT, DCT) — кривые с наиболее неравномерными искажениями, проявляющиеся в виде резких провалов и пиков в высокочастотной области. Метод Daubechies DWT демонстрирует полностью разрушенный спектр, что визуально подтверждает его неработоспособность.</w:t>
+      </w:r>
+    </w:p>
+    <w:p>
+      <w:pPr>
         <w:pStyle w:val="Heading3"/>
       </w:pPr>
       <w:r>
@@ -3835,7 +3877,7 @@
           <w:rFonts w:ascii="Times New Roman" w:hAnsi="Times New Roman"/>
           <w:sz w:val="28"/>
         </w:rPr>
-        <w:t>Критическое замечание о достоверности метрики MOS. В ходе анализа данных обнаружено, что метрика MOS использует нестандартную формулу преобразования из PESQ, отличную от рекомендованной ITU-T P.862.1. Стандартная формула ITU-T для PESQ = 2,01 должна давать MOS около 1,0 (масштаб [1; 4,5]), однако в экспериментальных данных для метода Daubechies DWT наблюдается MOS = 4,22 при PESQ = 2,01. Регрессионный анализ показывает, что фактически используется линейная аппроксимация MOS = 0,732 * PESQ + 2,207 (R^2 = 0,93), а не стандартная логистическая кривая ITU-T. В связи с этим метрика MOS признана недостоверной и в дальнейшем анализе приоритет отдаётся метрике PESQ.</w:t>
+        <w:t>Критическое замечание о достоверности метрики MOS. В ходе анализа данных обнаружено, что метрика MOS использует нестандартную формулу преобразования из PESQ, отличную от рекомендованной международным стандартом. Стандартная формула для PESQ = 2,01 должна давать MOS около 1,0 (масштаб [1; 4,5]), однако в экспериментальных данных для метода Daubechies DWT наблюдается MOS = 4,22 при PESQ = 2,01. Регрессионный анализ показывает, что фактически используется линейная аппроксимация MOS = 0,732 * PESQ + 2,207 (R^2 = 0,93), а не стандартная логистическая кривая. В связи с этим метрика MOS признана недостоверной и в дальнейшем анализе приоритет отдаётся метрике PESQ.</w:t>
       </w:r>
     </w:p>
     <w:p>
@@ -10814,7 +10856,7 @@
           <w:rFonts w:ascii="Times New Roman" w:hAnsi="Times New Roman"/>
           <w:sz w:val="28"/>
         </w:rPr>
-        <w:t>Время обработки Стандартного MP3 (0,94 с) почти вдвое меньше FWHT (1,96 с), что связано с использованием высокооптимизированной реализации кодека LAME. Таким образом, Стандартный MP3 превосходит FWHT как по качеству, так и по скорости, что делает его безусловным выбором для сценариев, где качество является приоритетом.</w:t>
+        <w:t>Время обработки Стандартного MP3 (0,94 с) почти вдвое меньше FWHT (1,96 с), что связано с использованием высокооптимизированной реализации стандарта MP3. Таким образом, Стандартный MP3 превосходит FWHT как по качеству, так и по скорости, что делает его безусловным выбором для сценариев, где качество является приоритетом.</w:t>
       </w:r>
     </w:p>
     <w:p>
@@ -12454,7 +12496,7 @@
           <w:rFonts w:ascii="Times New Roman" w:hAnsi="Times New Roman"/>
           <w:sz w:val="28"/>
         </w:rPr>
-        <w:t>На DSP-процессорах (например, Texas Instruments C6000) отсутствие умножений позволяет использовать каждый цикл процессора максимально эффективно. Для сравнения, FFT требует одного умножения на бабочку-операцию, тогда как FWHT - только двух сложений. При размере блока N = 2048 это означает экономию около 4096 операций умножения на блок.</w:t>
+        <w:t>На цифровых сигнальных процессорах (DSP) отсутствие умножений позволяет использовать каждый цикл процессора максимально эффективно. Для сравнения, FFT требует одного умножения на бабочку-операцию, тогда как FWHT - только двух сложений. При размере блока N = 2048 это означает экономию около 4096 операций умножения на блок.</w:t>
       </w:r>
     </w:p>
     <w:p>
@@ -12504,7 +12546,7 @@
           <w:rFonts w:ascii="Times New Roman" w:hAnsi="Times New Roman"/>
           <w:sz w:val="28"/>
         </w:rPr>
-        <w:t>Метод MDCT также требует оптимизации. Текущая реализация показывает Score 0,423 при времени обработки 3,08 с - худший показатель эффективности (Score/с = 0,137). Поскольку MDCT является стандартным преобразованием в кодеке MP3, потенциально метод может значительно улучшиться при использовании оптимизированных библиотек (например, FFmpeg) и корректном учёте критических полос частот. Методы DCT и FFT требуют решения проблемы перцептивного клиппинга (PESQ &lt; 0,5 для 30%+ файлов).</w:t>
+        <w:t>Метод MDCT также требует оптимизации. Текущая реализация показывает Score 0,423 при времени обработки 3,08 с - худший показатель эффективности (Score/с = 0,137). Поскольку MDCT является стандартным преобразованием в кодеке MP3, потенциально метод может значительно улучшиться при использовании сторонних оптимизированных библиотек и корректном учёте критических полос частот. Методы DCT и FFT требуют решения проблемы перцептивного клиппинга (PESQ &lt; 0,5 для 30%+ файлов).</w:t>
       </w:r>
     </w:p>
     <w:p>

</xml_diff>